<commit_message>
Fixed missing github link
</commit_message>
<xml_diff>
--- a/module-3/Assignment3_2/Fryer Assignment 3_2.docx
+++ b/module-3/Assignment3_2/Fryer Assignment 3_2.docx
@@ -10,6 +10,14 @@
     <w:p>
       <w:r>
         <w:t>Assignment 3.2 setting up landing page</w:t>
+      </w:r>
+    </w:p>
+    <w:p>
+      <w:r>
+        <w:t xml:space="preserve">GitHub page: </w:t>
+      </w:r>
+      <w:r>
+        <w:t>https://github.com/XcitedMonkie/csd-340</w:t>
       </w:r>
     </w:p>
     <w:p>
@@ -27,6 +35,9 @@
     </w:p>
     <w:p>
       <w:r>
+        <w:rPr>
+          <w:noProof/>
+        </w:rPr>
         <w:drawing>
           <wp:inline distT="0" distB="0" distL="0" distR="0" wp14:anchorId="73C52AF1" wp14:editId="121A0A2E">
             <wp:extent cx="3876675" cy="3328308"/>
@@ -71,6 +82,10 @@
     </w:p>
     <w:p>
       <w:r>
+        <w:rPr>
+          <w:noProof/>
+        </w:rPr>
+        <w:lastRenderedPageBreak/>
         <w:drawing>
           <wp:inline distT="0" distB="0" distL="0" distR="0" wp14:anchorId="55FE2044" wp14:editId="1ED6C7AB">
             <wp:extent cx="3248025" cy="3110863"/>
@@ -116,6 +131,9 @@
     </w:p>
     <w:p>
       <w:r>
+        <w:rPr>
+          <w:noProof/>
+        </w:rPr>
         <w:drawing>
           <wp:inline distT="0" distB="0" distL="0" distR="0" wp14:anchorId="2033CB7F" wp14:editId="021FF24B">
             <wp:extent cx="5943600" cy="4341495"/>
@@ -766,6 +784,7 @@
   <w:style w:type="character" w:default="1" w:styleId="DefaultParagraphFont">
     <w:name w:val="Default Paragraph Font"/>
     <w:uiPriority w:val="1"/>
+    <w:semiHidden/>
     <w:unhideWhenUsed/>
   </w:style>
   <w:style w:type="table" w:default="1" w:styleId="TableNormal">

</xml_diff>